<commit_message>
Final report PDF, report layout fixes, README for the finished project
</commit_message>
<xml_diff>
--- a/docs/report/DataChallenge_Team DIC005_Report.docx
+++ b/docs/report/DataChallenge_Team DIC005_Report.docx
@@ -72,7 +72,7 @@
           <w:b/>
           <w:bCs/>
         </w:rPr>
-        <w:t>Group: DIC005</w:t>
+        <w:t>Team Number: DIC005</w:t>
       </w:r>
     </w:p>
     <w:p>
@@ -631,6 +631,7 @@
           <w:sz w:val="28"/>
           <w:szCs w:val="28"/>
         </w:rPr>
+        <w:lastRenderedPageBreak/>
         <w:t>Table of Contents</w:t>
       </w:r>
     </w:p>
@@ -887,7 +888,7 @@
         <w:rPr>
           <w:noProof/>
         </w:rPr>
-        <w:t>8</w:t>
+        <w:t>9</w:t>
       </w:r>
       <w:r>
         <w:fldChar w:fldCharType="end"/>
@@ -919,7 +920,7 @@
         <w:rPr>
           <w:noProof/>
         </w:rPr>
-        <w:t>9</w:t>
+        <w:t>10</w:t>
       </w:r>
       <w:r>
         <w:fldChar w:fldCharType="end"/>
@@ -933,6 +934,7 @@
       </w:pPr>
       <w:bookmarkStart w:id="0" w:name="sec_summary"/>
       <w:r>
+        <w:lastRenderedPageBreak/>
         <w:t>Summary</w:t>
       </w:r>
       <w:bookmarkEnd w:id="0"/>
@@ -958,15 +960,13 @@
         <w:jc w:val="both"/>
       </w:pPr>
       <w:r>
-        <w:t xml:space="preserve">Only 1 of 96 communities has a connection known to meet </w:t>
-      </w:r>
-      <w:proofErr w:type="spellStart"/>
-      <w:r>
-        <w:t>healthdirect's</w:t>
-      </w:r>
-      <w:proofErr w:type="spellEnd"/>
-      <w:r>
-        <w:t xml:space="preserve"> latency requirement for video calls. In 31 communities the sources disagree about whether there is mobile coverage at all, and in 17 no public source records any mobile voice or SMS path.</w:t>
+        <w:t xml:space="preserve">Only 1 of 96 communities has a connection known to meet healthdirect's latency requirement for video calls. </w:t>
+      </w:r>
+      <w:r>
+        <w:t>In 33 communities the five sources disagree about whether there is mobile coverage at all</w:t>
+      </w:r>
+      <w:r>
+        <w:t>, and in 17 no public source records any mobile voice or SMS path.</w:t>
       </w:r>
     </w:p>
     <w:p>
@@ -1019,15 +1019,7 @@
         <w:jc w:val="both"/>
       </w:pPr>
       <w:r>
-        <w:t xml:space="preserve">Four bodies publish their own view of mobile coverage: carriers' predicted coverage (reported by the ACCC), the NT Government's community list, the ACMA licence register and </w:t>
-      </w:r>
-      <w:proofErr w:type="spellStart"/>
-      <w:r>
-        <w:t>BushTel</w:t>
-      </w:r>
-      <w:proofErr w:type="spellEnd"/>
-      <w:r>
-        <w:t xml:space="preserve"> community profiles. Their methods, dates and definitions of "covered" differ, so they often disagree. A fifth source, the National Audit of Mobile Coverage, is measured by a vehicle driving and recording signal, but it passes within 5 km of very few NT communities.</w:t>
+        <w:t>Four bodies publish their own view of mobile coverage: carriers' predicted coverage (reported by the ACCC), the NT Government's community list, the ACMA licence register and BushTel community profiles. Their methods, dates and definitions of "covered" differ, so they often disagree. A fifth source, the National Audit of Mobile Coverage, is measured by a vehicle driving and recording signal, but it passes within 5 km of very few NT communities.</w:t>
       </w:r>
     </w:p>
     <w:p>
@@ -1139,6 +1131,7 @@
                 <w:sz w:val="20"/>
                 <w:szCs w:val="20"/>
               </w:rPr>
+              <w:lastRenderedPageBreak/>
               <w:t>Dataset</w:t>
             </w:r>
           </w:p>
@@ -1709,21 +1702,12 @@
               <w:spacing w:after="0" w:line="240" w:lineRule="auto"/>
               <w:jc w:val="both"/>
             </w:pPr>
-            <w:proofErr w:type="spellStart"/>
-            <w:r>
-              <w:rPr>
-                <w:sz w:val="20"/>
-                <w:szCs w:val="20"/>
-              </w:rPr>
-              <w:t>BushTel</w:t>
-            </w:r>
-            <w:proofErr w:type="spellEnd"/>
-            <w:r>
-              <w:rPr>
-                <w:sz w:val="20"/>
-                <w:szCs w:val="20"/>
-              </w:rPr>
-              <w:t xml:space="preserve"> community profiles</w:t>
+            <w:r>
+              <w:rPr>
+                <w:sz w:val="20"/>
+                <w:szCs w:val="20"/>
+              </w:rPr>
+              <w:t>BushTel community profiles</w:t>
             </w:r>
           </w:p>
         </w:tc>
@@ -2032,50 +2016,10 @@
           <w:b/>
           <w:bCs/>
         </w:rPr>
-        <w:t>Telehealth video (</w:t>
-      </w:r>
-      <w:proofErr w:type="spellStart"/>
-      <w:r>
-        <w:rPr>
-          <w:b/>
-          <w:bCs/>
-        </w:rPr>
-        <w:t>healthdirect</w:t>
-      </w:r>
-      <w:proofErr w:type="spellEnd"/>
-      <w:r>
-        <w:rPr>
-          <w:b/>
-          <w:bCs/>
-        </w:rPr>
-        <w:t>):</w:t>
-      </w:r>
-      <w:r>
-        <w:t xml:space="preserve"> latency of 100 </w:t>
-      </w:r>
-      <w:proofErr w:type="spellStart"/>
-      <w:r>
-        <w:t>ms</w:t>
-      </w:r>
-      <w:proofErr w:type="spellEnd"/>
-      <w:r>
-        <w:t xml:space="preserve"> or less. The ACCC measured </w:t>
-      </w:r>
-      <w:proofErr w:type="spellStart"/>
-      <w:r>
-        <w:t>nbn's</w:t>
-      </w:r>
-      <w:proofErr w:type="spellEnd"/>
-      <w:r>
-        <w:t xml:space="preserve"> Sky Muster satellite at 664.9 </w:t>
-      </w:r>
-      <w:proofErr w:type="spellStart"/>
-      <w:r>
-        <w:t>ms</w:t>
-      </w:r>
-      <w:proofErr w:type="spellEnd"/>
-      <w:r>
-        <w:t xml:space="preserve"> on average. A satellite community "fails" unless a carrier's 4G footprint covers it; then it is "degraded", because 4G could work but no one has measured it there.</w:t>
+        <w:t>Telehealth video (healthdirect):</w:t>
+      </w:r>
+      <w:r>
+        <w:t xml:space="preserve"> latency of 100 ms or less. The ACCC measured nbn's Sky Muster satellite at 664.9 ms on average. A satellite community "fails" unless a carrier's 4G footprint covers it; then it is "degraded", because 4G could work but no one has measured it there.</w:t>
       </w:r>
     </w:p>
     <w:p>
@@ -2114,23 +2058,7 @@
           <w:b/>
           <w:bCs/>
         </w:rPr>
-        <w:t>Government websites (</w:t>
-      </w:r>
-      <w:proofErr w:type="spellStart"/>
-      <w:r>
-        <w:rPr>
-          <w:b/>
-          <w:bCs/>
-        </w:rPr>
-        <w:t>myGov</w:t>
-      </w:r>
-      <w:proofErr w:type="spellEnd"/>
-      <w:r>
-        <w:rPr>
-          <w:b/>
-          <w:bCs/>
-        </w:rPr>
-        <w:t>, Centrelink):</w:t>
+        <w:t>Government websites (myGov, Centrelink):</w:t>
       </w:r>
       <w:r>
         <w:t xml:space="preserve"> no published requirement; treated as working on any connection.</w:t>
@@ -2180,6 +2108,7 @@
         <w:jc w:val="both"/>
       </w:pPr>
       <w:r>
+        <w:lastRenderedPageBreak/>
         <w:t>Step 4: Grouping and ranking communities for action</w:t>
       </w:r>
     </w:p>
@@ -2928,7 +2857,10 @@
         <w:jc w:val="both"/>
       </w:pPr>
       <w:r>
-        <w:t>The results ship as a web app of about 1 MB that runs in any phone browser without internet. One phone can pass an updated version to another by showing a loop of QR codes, with no Wi-Fi, data or Bluetooth. "Report here" lets residents save their phone's rough connection estimate and share it by QR code or SMS if they choose. The app computes no verdict and runs no model.</w:t>
+        <w:t xml:space="preserve">The results ship as a web app of about 1 MB that runs in any phone browser without internet. One phone can pass an updated version to another by showing a loop of QR codes, with no Wi-Fi, data or Bluetooth. "Report here" lets residents save their phone's rough connection estimate and share it by QR code or SMS if they choose. </w:t>
+      </w:r>
+      <w:r>
+        <w:t>The app computes no verdict and runs no model. It is live at https://estaed.github.io/CDU_IT_CODEFAIR_DATA_2026/.</w:t>
       </w:r>
     </w:p>
     <w:p>
@@ -2956,31 +2888,13 @@
         <w:jc w:val="both"/>
       </w:pPr>
       <w:r>
-        <w:t xml:space="preserve">Of the 96 communities, the four published claims all agree on coverage for 54 and on no coverage for 11; for 31 they disagree. The most common disagreement (8 communities) is a licensed site within 5 km that no carrier map, government list or </w:t>
-      </w:r>
-      <w:proofErr w:type="spellStart"/>
-      <w:r>
-        <w:t>BushTel</w:t>
-      </w:r>
-      <w:proofErr w:type="spellEnd"/>
-      <w:r>
-        <w:t xml:space="preserve"> record shows. The drive test confirms the problem: within 5 km of </w:t>
-      </w:r>
-      <w:proofErr w:type="spellStart"/>
-      <w:r>
-        <w:t>Nauiyu</w:t>
-      </w:r>
-      <w:proofErr w:type="spellEnd"/>
-      <w:r>
-        <w:t xml:space="preserve">, </w:t>
-      </w:r>
-      <w:proofErr w:type="spellStart"/>
-      <w:r>
-        <w:t>Jilkminggan</w:t>
-      </w:r>
-      <w:proofErr w:type="spellEnd"/>
-      <w:r>
-        <w:t xml:space="preserve"> and Barunga it found no signal inside a carrier's claimed coverage.</w:t>
+        <w:t xml:space="preserve">Of the 96 communities, the four published claims all agree on coverage for 54 </w:t>
+      </w:r>
+      <w:r>
+        <w:t>and on no coverage for 11; for 31 they disagree. The app counts only sources that make a claim and adds the drive test as a fifth, which gives the 33 communities with conflicting data shown on its home screen.</w:t>
+      </w:r>
+      <w:r>
+        <w:t xml:space="preserve"> The most common disagreement (8 communities) is a licensed site within 5 km that no carrier map, government list or BushTel record shows. The drive test confirms the problem: within 5 km of Nauiyu, Jilkminggan and Barunga it found no signal inside a carrier's claimed coverage.</w:t>
       </w:r>
     </w:p>
     <w:p>
@@ -2989,6 +2903,7 @@
         <w:jc w:val="both"/>
       </w:pPr>
       <w:r>
+        <w:lastRenderedPageBreak/>
         <w:t>Finding 2: Telehealth video depends on an unmeasured link almost everywhere</w:t>
       </w:r>
     </w:p>
@@ -3063,31 +2978,7 @@
         <w:jc w:val="both"/>
       </w:pPr>
       <w:r>
-        <w:t xml:space="preserve">"No data" means no health centre or school is recorded there. 95 of 96 communities have only satellite for fixed internet, and its 664.9 </w:t>
-      </w:r>
-      <w:proofErr w:type="spellStart"/>
-      <w:r>
-        <w:t>ms</w:t>
-      </w:r>
-      <w:proofErr w:type="spellEnd"/>
-      <w:r>
-        <w:t xml:space="preserve"> delay breaks video calls. Only one community has a fixed-line path known to meet the 100 </w:t>
-      </w:r>
-      <w:proofErr w:type="spellStart"/>
-      <w:r>
-        <w:t>ms</w:t>
-      </w:r>
-      <w:proofErr w:type="spellEnd"/>
-      <w:r>
-        <w:t xml:space="preserve"> </w:t>
-      </w:r>
-      <w:proofErr w:type="gramStart"/>
-      <w:r>
-        <w:t>limit</w:t>
-      </w:r>
-      <w:proofErr w:type="gramEnd"/>
-      <w:r>
-        <w:t>; in 58, telehealth depends on an unmeasured 4G link, and 11 health-centre communities have no 4G footprint at all. "Connected" on a map is not "able to see a doctor online".</w:t>
+        <w:t>"No data" means no health centre or school is recorded there. 95 of 96 communities have only satellite for fixed internet, and its 664.9 ms delay breaks video calls. Only one community has a fixed-line path known to meet the 100 ms limit; in 58, telehealth depends on an unmeasured 4G link, and 11 health-centre communities have no 4G footprint at all. "Connected" on a map is not "able to see a doctor online".</w:t>
       </w:r>
     </w:p>
     <w:p>
@@ -3416,7 +3307,6 @@
               <w:spacing w:after="0" w:line="240" w:lineRule="auto"/>
               <w:jc w:val="both"/>
             </w:pPr>
-            <w:proofErr w:type="spellStart"/>
             <w:r>
               <w:rPr>
                 <w:sz w:val="20"/>
@@ -3424,7 +3314,6 @@
               </w:rPr>
               <w:t>Nitjpurru</w:t>
             </w:r>
-            <w:proofErr w:type="spellEnd"/>
           </w:p>
         </w:tc>
         <w:tc>
@@ -3508,21 +3397,12 @@
               <w:spacing w:after="0" w:line="240" w:lineRule="auto"/>
               <w:jc w:val="both"/>
             </w:pPr>
-            <w:proofErr w:type="gramStart"/>
-            <w:r>
-              <w:rPr>
-                <w:sz w:val="20"/>
-                <w:szCs w:val="20"/>
-              </w:rPr>
-              <w:t>Low-latency</w:t>
-            </w:r>
-            <w:proofErr w:type="gramEnd"/>
-            <w:r>
-              <w:rPr>
-                <w:sz w:val="20"/>
-                <w:szCs w:val="20"/>
-              </w:rPr>
-              <w:t xml:space="preserve"> backhaul</w:t>
+            <w:r>
+              <w:rPr>
+                <w:sz w:val="20"/>
+                <w:szCs w:val="20"/>
+              </w:rPr>
+              <w:t>Low-latency backhaul</w:t>
             </w:r>
           </w:p>
         </w:tc>
@@ -3552,17 +3432,8 @@
                 <w:sz w:val="20"/>
                 <w:szCs w:val="20"/>
               </w:rPr>
-              <w:t xml:space="preserve">DCDD, </w:t>
-            </w:r>
-            <w:proofErr w:type="spellStart"/>
-            <w:r>
-              <w:rPr>
-                <w:sz w:val="20"/>
-                <w:szCs w:val="20"/>
-              </w:rPr>
-              <w:t>nbn</w:t>
-            </w:r>
-            <w:proofErr w:type="spellEnd"/>
+              <w:t>DCDD, nbn</w:t>
+            </w:r>
           </w:p>
         </w:tc>
       </w:tr>
@@ -3621,7 +3492,6 @@
               <w:spacing w:after="0" w:line="240" w:lineRule="auto"/>
               <w:jc w:val="both"/>
             </w:pPr>
-            <w:proofErr w:type="spellStart"/>
             <w:r>
               <w:rPr>
                 <w:sz w:val="20"/>
@@ -3629,7 +3499,6 @@
               </w:rPr>
               <w:t>Amanbidji</w:t>
             </w:r>
-            <w:proofErr w:type="spellEnd"/>
           </w:p>
         </w:tc>
         <w:tc>
@@ -3713,21 +3582,12 @@
               <w:spacing w:after="0" w:line="240" w:lineRule="auto"/>
               <w:jc w:val="both"/>
             </w:pPr>
-            <w:proofErr w:type="gramStart"/>
-            <w:r>
-              <w:rPr>
-                <w:sz w:val="20"/>
-                <w:szCs w:val="20"/>
-              </w:rPr>
-              <w:t>Low-latency</w:t>
-            </w:r>
-            <w:proofErr w:type="gramEnd"/>
-            <w:r>
-              <w:rPr>
-                <w:sz w:val="20"/>
-                <w:szCs w:val="20"/>
-              </w:rPr>
-              <w:t xml:space="preserve"> backhaul</w:t>
+            <w:r>
+              <w:rPr>
+                <w:sz w:val="20"/>
+                <w:szCs w:val="20"/>
+              </w:rPr>
+              <w:t>Low-latency backhaul</w:t>
             </w:r>
           </w:p>
         </w:tc>
@@ -3757,17 +3617,8 @@
                 <w:sz w:val="20"/>
                 <w:szCs w:val="20"/>
               </w:rPr>
-              <w:t xml:space="preserve">DCDD, </w:t>
-            </w:r>
-            <w:proofErr w:type="spellStart"/>
-            <w:r>
-              <w:rPr>
-                <w:sz w:val="20"/>
-                <w:szCs w:val="20"/>
-              </w:rPr>
-              <w:t>nbn</w:t>
-            </w:r>
-            <w:proofErr w:type="spellEnd"/>
+              <w:t>DCDD, nbn</w:t>
+            </w:r>
           </w:p>
         </w:tc>
       </w:tr>
@@ -3916,21 +3767,12 @@
               <w:spacing w:after="0" w:line="240" w:lineRule="auto"/>
               <w:jc w:val="both"/>
             </w:pPr>
-            <w:proofErr w:type="gramStart"/>
-            <w:r>
-              <w:rPr>
-                <w:sz w:val="20"/>
-                <w:szCs w:val="20"/>
-              </w:rPr>
-              <w:t>Low-latency</w:t>
-            </w:r>
-            <w:proofErr w:type="gramEnd"/>
-            <w:r>
-              <w:rPr>
-                <w:sz w:val="20"/>
-                <w:szCs w:val="20"/>
-              </w:rPr>
-              <w:t xml:space="preserve"> backhaul</w:t>
+            <w:r>
+              <w:rPr>
+                <w:sz w:val="20"/>
+                <w:szCs w:val="20"/>
+              </w:rPr>
+              <w:t>Low-latency backhaul</w:t>
             </w:r>
           </w:p>
         </w:tc>
@@ -3960,17 +3802,8 @@
                 <w:sz w:val="20"/>
                 <w:szCs w:val="20"/>
               </w:rPr>
-              <w:t xml:space="preserve">DCDD, </w:t>
-            </w:r>
-            <w:proofErr w:type="spellStart"/>
-            <w:r>
-              <w:rPr>
-                <w:sz w:val="20"/>
-                <w:szCs w:val="20"/>
-              </w:rPr>
-              <w:t>nbn</w:t>
-            </w:r>
-            <w:proofErr w:type="spellEnd"/>
+              <w:t>DCDD, nbn</w:t>
+            </w:r>
           </w:p>
         </w:tc>
       </w:tr>
@@ -4029,7 +3862,6 @@
               <w:spacing w:after="0" w:line="240" w:lineRule="auto"/>
               <w:jc w:val="both"/>
             </w:pPr>
-            <w:proofErr w:type="spellStart"/>
             <w:r>
               <w:rPr>
                 <w:sz w:val="20"/>
@@ -4037,7 +3869,6 @@
               </w:rPr>
               <w:t>Rittarangu</w:t>
             </w:r>
-            <w:proofErr w:type="spellEnd"/>
           </w:p>
         </w:tc>
         <w:tc>
@@ -4121,21 +3952,12 @@
               <w:spacing w:after="0" w:line="240" w:lineRule="auto"/>
               <w:jc w:val="both"/>
             </w:pPr>
-            <w:proofErr w:type="gramStart"/>
-            <w:r>
-              <w:rPr>
-                <w:sz w:val="20"/>
-                <w:szCs w:val="20"/>
-              </w:rPr>
-              <w:t>Low-latency</w:t>
-            </w:r>
-            <w:proofErr w:type="gramEnd"/>
-            <w:r>
-              <w:rPr>
-                <w:sz w:val="20"/>
-                <w:szCs w:val="20"/>
-              </w:rPr>
-              <w:t xml:space="preserve"> backhaul</w:t>
+            <w:r>
+              <w:rPr>
+                <w:sz w:val="20"/>
+                <w:szCs w:val="20"/>
+              </w:rPr>
+              <w:t>Low-latency backhaul</w:t>
             </w:r>
           </w:p>
         </w:tc>
@@ -4165,17 +3987,8 @@
                 <w:sz w:val="20"/>
                 <w:szCs w:val="20"/>
               </w:rPr>
-              <w:t xml:space="preserve">DCDD, </w:t>
-            </w:r>
-            <w:proofErr w:type="spellStart"/>
-            <w:r>
-              <w:rPr>
-                <w:sz w:val="20"/>
-                <w:szCs w:val="20"/>
-              </w:rPr>
-              <w:t>nbn</w:t>
-            </w:r>
-            <w:proofErr w:type="spellEnd"/>
+              <w:t>DCDD, nbn</w:t>
+            </w:r>
           </w:p>
         </w:tc>
       </w:tr>
@@ -4234,7 +4047,6 @@
               <w:spacing w:after="0" w:line="240" w:lineRule="auto"/>
               <w:jc w:val="both"/>
             </w:pPr>
-            <w:proofErr w:type="spellStart"/>
             <w:r>
               <w:rPr>
                 <w:sz w:val="20"/>
@@ -4242,7 +4054,6 @@
               </w:rPr>
               <w:t>Dhalinybuy</w:t>
             </w:r>
-            <w:proofErr w:type="spellEnd"/>
           </w:p>
         </w:tc>
         <w:tc>
@@ -4326,21 +4137,12 @@
               <w:spacing w:after="0" w:line="240" w:lineRule="auto"/>
               <w:jc w:val="both"/>
             </w:pPr>
-            <w:proofErr w:type="gramStart"/>
-            <w:r>
-              <w:rPr>
-                <w:sz w:val="20"/>
-                <w:szCs w:val="20"/>
-              </w:rPr>
-              <w:t>Low-latency</w:t>
-            </w:r>
-            <w:proofErr w:type="gramEnd"/>
-            <w:r>
-              <w:rPr>
-                <w:sz w:val="20"/>
-                <w:szCs w:val="20"/>
-              </w:rPr>
-              <w:t xml:space="preserve"> backhaul</w:t>
+            <w:r>
+              <w:rPr>
+                <w:sz w:val="20"/>
+                <w:szCs w:val="20"/>
+              </w:rPr>
+              <w:t>Low-latency backhaul</w:t>
             </w:r>
           </w:p>
         </w:tc>
@@ -4370,17 +4172,8 @@
                 <w:sz w:val="20"/>
                 <w:szCs w:val="20"/>
               </w:rPr>
-              <w:t xml:space="preserve">DCDD, </w:t>
-            </w:r>
-            <w:proofErr w:type="spellStart"/>
-            <w:r>
-              <w:rPr>
-                <w:sz w:val="20"/>
-                <w:szCs w:val="20"/>
-              </w:rPr>
-              <w:t>nbn</w:t>
-            </w:r>
-            <w:proofErr w:type="spellEnd"/>
+              <w:t>DCDD, nbn</w:t>
+            </w:r>
           </w:p>
         </w:tc>
       </w:tr>
@@ -4444,17 +4237,8 @@
                 <w:sz w:val="20"/>
                 <w:szCs w:val="20"/>
               </w:rPr>
-              <w:t xml:space="preserve">Gan </w:t>
-            </w:r>
-            <w:proofErr w:type="spellStart"/>
-            <w:r>
-              <w:rPr>
-                <w:sz w:val="20"/>
-                <w:szCs w:val="20"/>
-              </w:rPr>
-              <w:t>Gan</w:t>
-            </w:r>
-            <w:proofErr w:type="spellEnd"/>
+              <w:t>Gan Gan</w:t>
+            </w:r>
           </w:p>
         </w:tc>
         <w:tc>
@@ -4538,21 +4322,12 @@
               <w:spacing w:after="0" w:line="240" w:lineRule="auto"/>
               <w:jc w:val="both"/>
             </w:pPr>
-            <w:proofErr w:type="gramStart"/>
-            <w:r>
-              <w:rPr>
-                <w:sz w:val="20"/>
-                <w:szCs w:val="20"/>
-              </w:rPr>
-              <w:t>Low-latency</w:t>
-            </w:r>
-            <w:proofErr w:type="gramEnd"/>
-            <w:r>
-              <w:rPr>
-                <w:sz w:val="20"/>
-                <w:szCs w:val="20"/>
-              </w:rPr>
-              <w:t xml:space="preserve"> backhaul</w:t>
+            <w:r>
+              <w:rPr>
+                <w:sz w:val="20"/>
+                <w:szCs w:val="20"/>
+              </w:rPr>
+              <w:t>Low-latency backhaul</w:t>
             </w:r>
           </w:p>
         </w:tc>
@@ -4582,17 +4357,8 @@
                 <w:sz w:val="20"/>
                 <w:szCs w:val="20"/>
               </w:rPr>
-              <w:t xml:space="preserve">DCDD, </w:t>
-            </w:r>
-            <w:proofErr w:type="spellStart"/>
-            <w:r>
-              <w:rPr>
-                <w:sz w:val="20"/>
-                <w:szCs w:val="20"/>
-              </w:rPr>
-              <w:t>nbn</w:t>
-            </w:r>
-            <w:proofErr w:type="spellEnd"/>
+              <w:t>DCDD, nbn</w:t>
+            </w:r>
           </w:p>
         </w:tc>
       </w:tr>
@@ -4651,7 +4417,6 @@
               <w:spacing w:after="0" w:line="240" w:lineRule="auto"/>
               <w:jc w:val="both"/>
             </w:pPr>
-            <w:proofErr w:type="spellStart"/>
             <w:r>
               <w:rPr>
                 <w:sz w:val="20"/>
@@ -4659,7 +4424,6 @@
               </w:rPr>
               <w:t>Woodycupaldiya</w:t>
             </w:r>
-            <w:proofErr w:type="spellEnd"/>
           </w:p>
         </w:tc>
         <w:tc>
@@ -4743,21 +4507,12 @@
               <w:spacing w:after="0" w:line="240" w:lineRule="auto"/>
               <w:jc w:val="both"/>
             </w:pPr>
-            <w:proofErr w:type="gramStart"/>
-            <w:r>
-              <w:rPr>
-                <w:sz w:val="20"/>
-                <w:szCs w:val="20"/>
-              </w:rPr>
-              <w:t>Low-latency</w:t>
-            </w:r>
-            <w:proofErr w:type="gramEnd"/>
-            <w:r>
-              <w:rPr>
-                <w:sz w:val="20"/>
-                <w:szCs w:val="20"/>
-              </w:rPr>
-              <w:t xml:space="preserve"> backhaul</w:t>
+            <w:r>
+              <w:rPr>
+                <w:sz w:val="20"/>
+                <w:szCs w:val="20"/>
+              </w:rPr>
+              <w:t>Low-latency backhaul</w:t>
             </w:r>
           </w:p>
         </w:tc>
@@ -4787,17 +4542,8 @@
                 <w:sz w:val="20"/>
                 <w:szCs w:val="20"/>
               </w:rPr>
-              <w:t xml:space="preserve">DCDD, </w:t>
-            </w:r>
-            <w:proofErr w:type="spellStart"/>
-            <w:r>
-              <w:rPr>
-                <w:sz w:val="20"/>
-                <w:szCs w:val="20"/>
-              </w:rPr>
-              <w:t>nbn</w:t>
-            </w:r>
-            <w:proofErr w:type="spellEnd"/>
+              <w:t>DCDD, nbn</w:t>
+            </w:r>
           </w:p>
         </w:tc>
       </w:tr>
@@ -4856,7 +4602,6 @@
               <w:spacing w:after="0" w:line="240" w:lineRule="auto"/>
               <w:jc w:val="both"/>
             </w:pPr>
-            <w:proofErr w:type="spellStart"/>
             <w:r>
               <w:rPr>
                 <w:sz w:val="20"/>
@@ -4864,7 +4609,6 @@
               </w:rPr>
               <w:t>Gurrumuru</w:t>
             </w:r>
-            <w:proofErr w:type="spellEnd"/>
           </w:p>
         </w:tc>
         <w:tc>
@@ -4948,21 +4692,12 @@
               <w:spacing w:after="0" w:line="240" w:lineRule="auto"/>
               <w:jc w:val="both"/>
             </w:pPr>
-            <w:proofErr w:type="gramStart"/>
-            <w:r>
-              <w:rPr>
-                <w:sz w:val="20"/>
-                <w:szCs w:val="20"/>
-              </w:rPr>
-              <w:t>Low-latency</w:t>
-            </w:r>
-            <w:proofErr w:type="gramEnd"/>
-            <w:r>
-              <w:rPr>
-                <w:sz w:val="20"/>
-                <w:szCs w:val="20"/>
-              </w:rPr>
-              <w:t xml:space="preserve"> backhaul</w:t>
+            <w:r>
+              <w:rPr>
+                <w:sz w:val="20"/>
+                <w:szCs w:val="20"/>
+              </w:rPr>
+              <w:t>Low-latency backhaul</w:t>
             </w:r>
           </w:p>
         </w:tc>
@@ -4992,17 +4727,8 @@
                 <w:sz w:val="20"/>
                 <w:szCs w:val="20"/>
               </w:rPr>
-              <w:t xml:space="preserve">DCDD, </w:t>
-            </w:r>
-            <w:proofErr w:type="spellStart"/>
-            <w:r>
-              <w:rPr>
-                <w:sz w:val="20"/>
-                <w:szCs w:val="20"/>
-              </w:rPr>
-              <w:t>nbn</w:t>
-            </w:r>
-            <w:proofErr w:type="spellEnd"/>
+              <w:t>DCDD, nbn</w:t>
+            </w:r>
           </w:p>
         </w:tc>
       </w:tr>
@@ -5061,7 +4787,6 @@
               <w:spacing w:after="0" w:line="240" w:lineRule="auto"/>
               <w:jc w:val="both"/>
             </w:pPr>
-            <w:proofErr w:type="spellStart"/>
             <w:r>
               <w:rPr>
                 <w:sz w:val="20"/>
@@ -5069,7 +4794,6 @@
               </w:rPr>
               <w:t>Baniyala</w:t>
             </w:r>
-            <w:proofErr w:type="spellEnd"/>
           </w:p>
         </w:tc>
         <w:tc>
@@ -5153,21 +4877,12 @@
               <w:spacing w:after="0" w:line="240" w:lineRule="auto"/>
               <w:jc w:val="both"/>
             </w:pPr>
-            <w:proofErr w:type="gramStart"/>
-            <w:r>
-              <w:rPr>
-                <w:sz w:val="20"/>
-                <w:szCs w:val="20"/>
-              </w:rPr>
-              <w:t>Low-latency</w:t>
-            </w:r>
-            <w:proofErr w:type="gramEnd"/>
-            <w:r>
-              <w:rPr>
-                <w:sz w:val="20"/>
-                <w:szCs w:val="20"/>
-              </w:rPr>
-              <w:t xml:space="preserve"> backhaul</w:t>
+            <w:r>
+              <w:rPr>
+                <w:sz w:val="20"/>
+                <w:szCs w:val="20"/>
+              </w:rPr>
+              <w:t>Low-latency backhaul</w:t>
             </w:r>
           </w:p>
         </w:tc>
@@ -5197,17 +4912,8 @@
                 <w:sz w:val="20"/>
                 <w:szCs w:val="20"/>
               </w:rPr>
-              <w:t xml:space="preserve">DCDD, </w:t>
-            </w:r>
-            <w:proofErr w:type="spellStart"/>
-            <w:r>
-              <w:rPr>
-                <w:sz w:val="20"/>
-                <w:szCs w:val="20"/>
-              </w:rPr>
-              <w:t>nbn</w:t>
-            </w:r>
-            <w:proofErr w:type="spellEnd"/>
+              <w:t>DCDD, nbn</w:t>
+            </w:r>
           </w:p>
         </w:tc>
       </w:tr>
@@ -5266,7 +4972,6 @@
               <w:spacing w:after="0" w:line="240" w:lineRule="auto"/>
               <w:jc w:val="both"/>
             </w:pPr>
-            <w:proofErr w:type="spellStart"/>
             <w:r>
               <w:rPr>
                 <w:sz w:val="20"/>
@@ -5274,7 +4979,6 @@
               </w:rPr>
               <w:t>Orrtipa-Thurra</w:t>
             </w:r>
-            <w:proofErr w:type="spellEnd"/>
           </w:p>
         </w:tc>
         <w:tc>
@@ -5358,21 +5062,12 @@
               <w:spacing w:after="0" w:line="240" w:lineRule="auto"/>
               <w:jc w:val="both"/>
             </w:pPr>
-            <w:proofErr w:type="gramStart"/>
-            <w:r>
-              <w:rPr>
-                <w:sz w:val="20"/>
-                <w:szCs w:val="20"/>
-              </w:rPr>
-              <w:t>Low-latency</w:t>
-            </w:r>
-            <w:proofErr w:type="gramEnd"/>
-            <w:r>
-              <w:rPr>
-                <w:sz w:val="20"/>
-                <w:szCs w:val="20"/>
-              </w:rPr>
-              <w:t xml:space="preserve"> backhaul</w:t>
+            <w:r>
+              <w:rPr>
+                <w:sz w:val="20"/>
+                <w:szCs w:val="20"/>
+              </w:rPr>
+              <w:t>Low-latency backhaul</w:t>
             </w:r>
           </w:p>
         </w:tc>
@@ -5402,17 +5097,8 @@
                 <w:sz w:val="20"/>
                 <w:szCs w:val="20"/>
               </w:rPr>
-              <w:t xml:space="preserve">DCDD, </w:t>
-            </w:r>
-            <w:proofErr w:type="spellStart"/>
-            <w:r>
-              <w:rPr>
-                <w:sz w:val="20"/>
-                <w:szCs w:val="20"/>
-              </w:rPr>
-              <w:t>nbn</w:t>
-            </w:r>
-            <w:proofErr w:type="spellEnd"/>
+              <w:t>DCDD, nbn</w:t>
+            </w:r>
           </w:p>
         </w:tc>
       </w:tr>
@@ -5428,23 +5114,8 @@
         <w:jc w:val="both"/>
       </w:pPr>
       <w:r>
-        <w:t xml:space="preserve">The evidence-check group follows, led by larger communities whose link is unverified or fragile rather than missing: </w:t>
-      </w:r>
-      <w:proofErr w:type="spellStart"/>
-      <w:r>
-        <w:t>Nauiyu</w:t>
-      </w:r>
-      <w:proofErr w:type="spellEnd"/>
-      <w:r>
-        <w:t xml:space="preserve"> (verify on the ground), Galiwinku (backup power), Maningrida (measure the link), </w:t>
-      </w:r>
-      <w:proofErr w:type="spellStart"/>
-      <w:r>
-        <w:t>Wurrumiyanga</w:t>
-      </w:r>
-      <w:proofErr w:type="spellEnd"/>
-      <w:r>
-        <w:t xml:space="preserve"> and Milingimbi (backup power).</w:t>
+        <w:lastRenderedPageBreak/>
+        <w:t>The evidence-check group follows, led by larger communities whose link is unverified or fragile rather than missing: Nauiyu (verify on the ground), Galiwinku (backup power), Maningrida (measure the link), Wurrumiyanga and Milingimbi (backup power).</w:t>
       </w:r>
     </w:p>
     <w:p>
@@ -6017,21 +5688,12 @@
               <w:spacing w:after="0" w:line="240" w:lineRule="auto"/>
               <w:jc w:val="both"/>
             </w:pPr>
-            <w:proofErr w:type="gramStart"/>
-            <w:r>
-              <w:rPr>
-                <w:sz w:val="20"/>
-                <w:szCs w:val="20"/>
-              </w:rPr>
-              <w:t>Low-latency</w:t>
-            </w:r>
-            <w:proofErr w:type="gramEnd"/>
-            <w:r>
-              <w:rPr>
-                <w:sz w:val="20"/>
-                <w:szCs w:val="20"/>
-              </w:rPr>
-              <w:t xml:space="preserve"> backhaul</w:t>
+            <w:r>
+              <w:rPr>
+                <w:sz w:val="20"/>
+                <w:szCs w:val="20"/>
+              </w:rPr>
+              <w:t>Low-latency backhaul</w:t>
             </w:r>
           </w:p>
         </w:tc>
@@ -6121,17 +5783,8 @@
                 <w:sz w:val="20"/>
                 <w:szCs w:val="20"/>
               </w:rPr>
-              <w:t xml:space="preserve">DCDD, </w:t>
-            </w:r>
-            <w:proofErr w:type="spellStart"/>
-            <w:r>
-              <w:rPr>
-                <w:sz w:val="20"/>
-                <w:szCs w:val="20"/>
-              </w:rPr>
-              <w:t>nbn</w:t>
-            </w:r>
-            <w:proofErr w:type="spellEnd"/>
+              <w:t>DCDD, nbn</w:t>
+            </w:r>
           </w:p>
         </w:tc>
       </w:tr>
@@ -6735,23 +6388,11 @@
         <w:jc w:val="both"/>
       </w:pPr>
       <w:r>
-        <w:t xml:space="preserve">Almost all 96 communities are First Nations communities. Following the CARE Principles for Indigenous Data Governance (Collective benefit, Authority to control, Responsibility, Ethics), </w:t>
-      </w:r>
-      <w:proofErr w:type="spellStart"/>
-      <w:r>
-        <w:t>BushTel</w:t>
-      </w:r>
-      <w:proofErr w:type="spellEnd"/>
-      <w:r>
-        <w:t xml:space="preserve"> profiles are used only for structural facts and their text is not reproduced until </w:t>
-      </w:r>
-      <w:proofErr w:type="spellStart"/>
-      <w:r>
-        <w:t>BushTel</w:t>
-      </w:r>
-      <w:proofErr w:type="spellEnd"/>
-      <w:r>
-        <w:t xml:space="preserve"> confirms its reuse terms, and the drive-test data only trains the model, never judging an individual community. Two sources carry no stated licence and requests are on file; the ADII and cyclone components stay at zero weight until theirs are confirmed.</w:t>
+        <w:t xml:space="preserve">Almost all 96 communities are First Nations communities. Following the CARE Principles for Indigenous Data Governance (Collective benefit, Authority to control, Responsibility, Ethics), BushTel </w:t>
+      </w:r>
+      <w:r>
+        <w:lastRenderedPageBreak/>
+        <w:t>profiles are used only for structural facts and their text is not reproduced until BushTel confirms its reuse terms, and the drive-test data only trains the model, never judging an individual community. Two sources carry no stated licence and requests are on file; the ADII and cyclone components stay at zero weight until theirs are confirmed.</w:t>
       </w:r>
     </w:p>
     <w:p>
@@ -6836,31 +6477,7 @@
         <w:jc w:val="both"/>
       </w:pPr>
       <w:r>
-        <w:t xml:space="preserve">Visit </w:t>
-      </w:r>
-      <w:proofErr w:type="spellStart"/>
-      <w:r>
-        <w:t>Nauiyu</w:t>
-      </w:r>
-      <w:proofErr w:type="spellEnd"/>
-      <w:r>
-        <w:t xml:space="preserve">, </w:t>
-      </w:r>
-      <w:proofErr w:type="spellStart"/>
-      <w:r>
-        <w:t>Jilkminggan</w:t>
-      </w:r>
-      <w:proofErr w:type="spellEnd"/>
-      <w:r>
-        <w:t xml:space="preserve"> and Barunga, where the government's own drive test contradicts carrier coverage. </w:t>
-      </w:r>
-      <w:proofErr w:type="gramStart"/>
-      <w:r>
-        <w:t>This costs</w:t>
-      </w:r>
-      <w:proofErr w:type="gramEnd"/>
-      <w:r>
-        <w:t xml:space="preserve"> travel time, not capital.</w:t>
+        <w:t>Visit Nauiyu, Jilkminggan and Barunga, where the government's own drive test contradicts carrier coverage. This costs travel time, not capital.</w:t>
       </w:r>
     </w:p>
     <w:p>
@@ -6948,15 +6565,7 @@
         <w:jc w:val="both"/>
       </w:pPr>
       <w:r>
-        <w:t xml:space="preserve">For </w:t>
-      </w:r>
-      <w:proofErr w:type="spellStart"/>
-      <w:r>
-        <w:t>nbn</w:t>
-      </w:r>
-      <w:proofErr w:type="spellEnd"/>
-      <w:r>
-        <w:t xml:space="preserve"> and DCDD</w:t>
+        <w:t>For nbn and DCDD</w:t>
       </w:r>
     </w:p>
     <w:p>
@@ -6970,23 +6579,7 @@
         <w:jc w:val="both"/>
       </w:pPr>
       <w:r>
-        <w:t xml:space="preserve">The 12 health centres on satellite-only paths cannot run telehealth on Sky Muster's 664.9 </w:t>
-      </w:r>
-      <w:proofErr w:type="spellStart"/>
-      <w:r>
-        <w:t>ms</w:t>
-      </w:r>
-      <w:proofErr w:type="spellEnd"/>
-      <w:r>
-        <w:t xml:space="preserve">. They need a low-latency link: the ACCC measured low-Earth-orbit satellite (Starlink) at 29.8 </w:t>
-      </w:r>
-      <w:proofErr w:type="spellStart"/>
-      <w:r>
-        <w:t>ms</w:t>
-      </w:r>
-      <w:proofErr w:type="spellEnd"/>
-      <w:r>
-        <w:t>, or a terrestrial link. Sky Muster's faster plans do not change latency.</w:t>
+        <w:t>The 12 health centres on satellite-only paths cannot run telehealth on Sky Muster's 664.9 ms. They need a low-latency link: the ACCC measured low-Earth-orbit satellite (Starlink) at 29.8 ms, or a terrestrial link. Sky Muster's faster plans do not change latency.</w:t>
       </w:r>
     </w:p>
     <w:p>
@@ -7014,77 +6607,13 @@
     </w:p>
     <w:p>
       <w:pPr>
-        <w:spacing w:after="60"/>
-        <w:jc w:val="both"/>
-      </w:pPr>
-    </w:p>
-    <w:p>
-      <w:pPr>
-        <w:spacing w:after="60"/>
-        <w:jc w:val="both"/>
-      </w:pPr>
-    </w:p>
-    <w:p>
-      <w:pPr>
-        <w:spacing w:after="60"/>
-        <w:jc w:val="both"/>
-      </w:pPr>
-    </w:p>
-    <w:p>
-      <w:pPr>
-        <w:spacing w:after="60"/>
-        <w:jc w:val="both"/>
-      </w:pPr>
-    </w:p>
-    <w:p>
-      <w:pPr>
-        <w:spacing w:after="60"/>
-        <w:jc w:val="both"/>
-      </w:pPr>
-    </w:p>
-    <w:p>
-      <w:pPr>
-        <w:spacing w:after="60"/>
-        <w:jc w:val="both"/>
-      </w:pPr>
-    </w:p>
-    <w:p>
-      <w:pPr>
-        <w:spacing w:after="60"/>
-        <w:jc w:val="both"/>
-      </w:pPr>
-    </w:p>
-    <w:p>
-      <w:pPr>
-        <w:spacing w:after="60"/>
-        <w:jc w:val="both"/>
-      </w:pPr>
-    </w:p>
-    <w:p>
-      <w:pPr>
-        <w:spacing w:after="60"/>
-        <w:jc w:val="both"/>
-      </w:pPr>
-    </w:p>
-    <w:p>
-      <w:pPr>
-        <w:spacing w:after="60"/>
-        <w:jc w:val="both"/>
-      </w:pPr>
-    </w:p>
-    <w:p>
-      <w:pPr>
-        <w:spacing w:after="60"/>
-        <w:jc w:val="both"/>
-      </w:pPr>
-    </w:p>
-    <w:p>
-      <w:pPr>
         <w:pStyle w:val="Heading1"/>
+        <w:pageBreakBefore/>
         <w:jc w:val="both"/>
       </w:pPr>
       <w:bookmarkStart w:id="6" w:name="sec_references"/>
       <w:r>
+        <w:lastRenderedPageBreak/>
         <w:t>References</w:t>
       </w:r>
       <w:bookmarkEnd w:id="6"/>
@@ -7191,21 +6720,12 @@
         <w:ind w:left="567" w:hanging="567"/>
         <w:jc w:val="both"/>
       </w:pPr>
-      <w:proofErr w:type="spellStart"/>
       <w:r>
         <w:rPr>
           <w:sz w:val="20"/>
           <w:szCs w:val="20"/>
         </w:rPr>
-        <w:t>BushTel</w:t>
-      </w:r>
-      <w:proofErr w:type="spellEnd"/>
-      <w:r>
-        <w:rPr>
-          <w:sz w:val="20"/>
-          <w:szCs w:val="20"/>
-        </w:rPr>
-        <w:t xml:space="preserve"> (2026). Community profiles. Northern Territory Government. </w:t>
+        <w:t xml:space="preserve">BushTel (2026). Community profiles. Northern Territory Government. </w:t>
       </w:r>
       <w:hyperlink r:id="rId13" w:history="1">
         <w:r>
@@ -7312,21 +6832,12 @@
         <w:ind w:left="567" w:hanging="567"/>
         <w:jc w:val="both"/>
       </w:pPr>
-      <w:proofErr w:type="spellStart"/>
       <w:r>
         <w:rPr>
           <w:sz w:val="20"/>
           <w:szCs w:val="20"/>
         </w:rPr>
-        <w:t>healthdirect</w:t>
-      </w:r>
-      <w:proofErr w:type="spellEnd"/>
-      <w:r>
-        <w:rPr>
-          <w:sz w:val="20"/>
-          <w:szCs w:val="20"/>
-        </w:rPr>
-        <w:t xml:space="preserve"> Australia (2026). Video Call: bandwidth and data usage. </w:t>
+        <w:t xml:space="preserve">healthdirect Australia (2026). Video Call: bandwidth and data usage. </w:t>
       </w:r>
       <w:hyperlink r:id="rId17" w:history="1">
         <w:r>
@@ -7369,37 +6880,12 @@
         <w:ind w:left="567" w:hanging="567"/>
         <w:jc w:val="both"/>
       </w:pPr>
-      <w:proofErr w:type="spellStart"/>
       <w:r>
         <w:rPr>
           <w:sz w:val="20"/>
           <w:szCs w:val="20"/>
         </w:rPr>
-        <w:t>nbn</w:t>
-      </w:r>
-      <w:proofErr w:type="spellEnd"/>
-      <w:r>
-        <w:rPr>
-          <w:sz w:val="20"/>
-          <w:szCs w:val="20"/>
-        </w:rPr>
-        <w:t xml:space="preserve"> co (2024). </w:t>
-      </w:r>
-      <w:proofErr w:type="spellStart"/>
-      <w:r>
-        <w:rPr>
-          <w:sz w:val="20"/>
-          <w:szCs w:val="20"/>
-        </w:rPr>
-        <w:t>nbn</w:t>
-      </w:r>
-      <w:proofErr w:type="spellEnd"/>
-      <w:r>
-        <w:rPr>
-          <w:sz w:val="20"/>
-          <w:szCs w:val="20"/>
-        </w:rPr>
-        <w:t xml:space="preserve"> fixed-line and fixed-wireless coverage footprints. CC BY 4.0. </w:t>
+        <w:t xml:space="preserve">nbn co (2024). nbn fixed-line and fixed-wireless coverage footprints. CC BY 4.0. </w:t>
       </w:r>
       <w:hyperlink r:id="rId19" w:history="1">
         <w:r>
@@ -7418,21 +6904,12 @@
         <w:ind w:left="567" w:hanging="567"/>
         <w:jc w:val="both"/>
       </w:pPr>
-      <w:proofErr w:type="spellStart"/>
       <w:r>
         <w:rPr>
           <w:sz w:val="20"/>
           <w:szCs w:val="20"/>
         </w:rPr>
-        <w:t>nbn</w:t>
-      </w:r>
-      <w:proofErr w:type="spellEnd"/>
-      <w:r>
-        <w:rPr>
-          <w:sz w:val="20"/>
-          <w:szCs w:val="20"/>
-        </w:rPr>
-        <w:t xml:space="preserve"> co (2026). Sky Muster Plus explained. </w:t>
+        <w:t xml:space="preserve">nbn co (2026). Sky Muster Plus explained. </w:t>
       </w:r>
       <w:hyperlink r:id="rId20" w:history="1">
         <w:r>
@@ -7502,10 +6979,12 @@
     <w:p>
       <w:pPr>
         <w:pStyle w:val="Heading1"/>
+        <w:pageBreakBefore/>
         <w:jc w:val="both"/>
       </w:pPr>
       <w:bookmarkStart w:id="7" w:name="sec_appendix"/>
       <w:r>
+        <w:lastRenderedPageBreak/>
         <w:t>Appendix</w:t>
       </w:r>
       <w:bookmarkEnd w:id="7"/>
@@ -7541,18 +7020,10 @@
         <w:jc w:val="both"/>
       </w:pPr>
       <w:r>
-        <w:t xml:space="preserve">The full Python source and a README with reproduction instructions are in the submitted zip file and at </w:t>
-      </w:r>
-      <w:hyperlink r:id="rId22" w:history="1">
-        <w:r>
-          <w:rPr>
-            <w:rStyle w:val="Hyperlink"/>
-          </w:rPr>
-          <w:t>https://github.com/Estaed/CDU_IT_CODEFAIR_DATA_2026</w:t>
-        </w:r>
-      </w:hyperlink>
-      <w:r>
-        <w:t>.</w:t>
+        <w:t xml:space="preserve">The full Python source and a README with reproduction instructions </w:t>
+      </w:r>
+      <w:r>
+        <w:t>are in the submitted zip file and at https://github.com/Estaed/CDU_IT_CODEFAIR_DATA_2026. The interactive prototype runs at https://estaed.github.io/CDU_IT_CODEFAIR_DATA_2026/ and as index.html in the zip.</w:t>
       </w:r>
     </w:p>
     <w:p>
@@ -7573,7 +7044,7 @@
       </w:r>
       <w:r>
         <w:rPr>
-          <w:rFonts w:ascii="Consolas" w:eastAsia="Consolas" w:hAnsi="Consolas" w:cs="Consolas"/>
+          <w:rFonts w:eastAsia="Consolas"/>
           <w:sz w:val="20"/>
           <w:szCs w:val="20"/>
         </w:rPr>
@@ -7584,8 +7055,12 @@
       </w:r>
     </w:p>
     <w:sectPr>
+      <w:headerReference w:type="even" r:id="rId22"/>
       <w:headerReference w:type="default" r:id="rId23"/>
-      <w:footerReference w:type="default" r:id="rId24"/>
+      <w:footerReference w:type="even" r:id="rId24"/>
+      <w:footerReference w:type="default" r:id="rId25"/>
+      <w:headerReference w:type="first" r:id="rId26"/>
+      <w:footerReference w:type="first" r:id="rId27"/>
       <w:pgSz w:w="11906" w:h="16838"/>
       <w:pgMar w:top="1440" w:right="1440" w:bottom="1440" w:left="1440" w:header="709" w:footer="709" w:gutter="0"/>
       <w:pgNumType w:start="1"/>
@@ -7622,6 +7097,16 @@
 </file>
 
 <file path=word/footer1.xml><?xml version="1.0" encoding="utf-8"?>
+<w:ftr xmlns:wpc="http://schemas.microsoft.com/office/word/2010/wordprocessingCanvas" xmlns:cx="http://schemas.microsoft.com/office/drawing/2014/chartex" xmlns:cx1="http://schemas.microsoft.com/office/drawing/2015/9/8/chartex" xmlns:cx2="http://schemas.microsoft.com/office/drawing/2015/10/21/chartex" xmlns:cx3="http://schemas.microsoft.com/office/drawing/2016/5/9/chartex" xmlns:cx4="http://schemas.microsoft.com/office/drawing/2016/5/10/chartex" xmlns:cx5="http://schemas.microsoft.com/office/drawing/2016/5/11/chartex" xmlns:cx6="http://schemas.microsoft.com/office/drawing/2016/5/12/chartex" xmlns:cx7="http://schemas.microsoft.com/office/drawing/2016/5/13/chartex" xmlns:cx8="http://schemas.microsoft.com/office/drawing/2016/5/14/chartex" xmlns:mc="http://schemas.openxmlformats.org/markup-compatibility/2006" xmlns:aink="http://schemas.microsoft.com/office/drawing/2016/ink" xmlns:am3d="http://schemas.microsoft.com/office/drawing/2017/model3d" xmlns:o="urn:schemas-microsoft-com:office:office" xmlns:oel="http://schemas.microsoft.com/office/2019/extlst" xmlns:r="http://schemas.openxmlformats.org/officeDocument/2006/relationships" xmlns:m="http://schemas.openxmlformats.org/officeDocument/2006/math" xmlns:v="urn:schemas-microsoft-com:vml" xmlns:wp14="http://schemas.microsoft.com/office/word/2010/wordprocessingDrawing" xmlns:wp="http://schemas.openxmlformats.org/drawingml/2006/wordprocessingDrawing" xmlns:w10="urn:schemas-microsoft-com:office:word" xmlns:w="http://schemas.openxmlformats.org/wordprocessingml/2006/main" xmlns:w14="http://schemas.microsoft.com/office/word/2010/wordml" xmlns:w15="http://schemas.microsoft.com/office/word/2012/wordml" xmlns:w16cex="http://schemas.microsoft.com/office/word/2018/wordml/cex" xmlns:w16cid="http://schemas.microsoft.com/office/word/2016/wordml/cid" xmlns:w16="http://schemas.microsoft.com/office/word/2018/wordml" xmlns:w16du="http://schemas.microsoft.com/office/word/2023/wordml/word16du" xmlns:w16sdtdh="http://schemas.microsoft.com/office/word/2020/wordml/sdtdatahash" xmlns:w16sdtfl="http://schemas.microsoft.com/office/word/2024/wordml/sdtformatlock" xmlns:w16se="http://schemas.microsoft.com/office/word/2015/wordml/symex" xmlns:wpg="http://schemas.microsoft.com/office/word/2010/wordprocessingGroup" xmlns:wpi="http://schemas.microsoft.com/office/word/2010/wordprocessingInk" xmlns:wne="http://schemas.microsoft.com/office/word/2006/wordml" xmlns:wps="http://schemas.microsoft.com/office/word/2010/wordprocessingShape" mc:Ignorable="w14 w15 w16se w16cid w16 w16cex w16sdtdh w16sdtfl w16du wp14">
+  <w:p>
+    <w:pPr>
+      <w:pStyle w:val="Footer"/>
+    </w:pPr>
+  </w:p>
+</w:ftr>
+</file>
+
+<file path=word/footer2.xml><?xml version="1.0" encoding="utf-8"?>
 <w:ftr xmlns:wpc="http://schemas.microsoft.com/office/word/2010/wordprocessingCanvas" xmlns:cx="http://schemas.microsoft.com/office/drawing/2014/chartex" xmlns:cx1="http://schemas.microsoft.com/office/drawing/2015/9/8/chartex" xmlns:cx2="http://schemas.microsoft.com/office/drawing/2015/10/21/chartex" xmlns:cx3="http://schemas.microsoft.com/office/drawing/2016/5/9/chartex" xmlns:cx4="http://schemas.microsoft.com/office/drawing/2016/5/10/chartex" xmlns:cx5="http://schemas.microsoft.com/office/drawing/2016/5/11/chartex" xmlns:cx6="http://schemas.microsoft.com/office/drawing/2016/5/12/chartex" xmlns:cx7="http://schemas.microsoft.com/office/drawing/2016/5/13/chartex" xmlns:cx8="http://schemas.microsoft.com/office/drawing/2016/5/14/chartex" xmlns:mc="http://schemas.openxmlformats.org/markup-compatibility/2006" xmlns:aink="http://schemas.microsoft.com/office/drawing/2016/ink" xmlns:am3d="http://schemas.microsoft.com/office/drawing/2017/model3d" xmlns:o="urn:schemas-microsoft-com:office:office" xmlns:oel="http://schemas.microsoft.com/office/2019/extlst" xmlns:r="http://schemas.openxmlformats.org/officeDocument/2006/relationships" xmlns:m="http://schemas.openxmlformats.org/officeDocument/2006/math" xmlns:v="urn:schemas-microsoft-com:vml" xmlns:wp14="http://schemas.microsoft.com/office/word/2010/wordprocessingDrawing" xmlns:wp="http://schemas.openxmlformats.org/drawingml/2006/wordprocessingDrawing" xmlns:w10="urn:schemas-microsoft-com:office:word" xmlns:w="http://schemas.openxmlformats.org/wordprocessingml/2006/main" xmlns:w14="http://schemas.microsoft.com/office/word/2010/wordml" xmlns:w15="http://schemas.microsoft.com/office/word/2012/wordml" xmlns:w16cex="http://schemas.microsoft.com/office/word/2018/wordml/cex" xmlns:w16cid="http://schemas.microsoft.com/office/word/2016/wordml/cid" xmlns:w16="http://schemas.microsoft.com/office/word/2018/wordml" xmlns:w16du="http://schemas.microsoft.com/office/word/2023/wordml/word16du" xmlns:w16sdtdh="http://schemas.microsoft.com/office/word/2020/wordml/sdtdatahash" xmlns:w16sdtfl="http://schemas.microsoft.com/office/word/2024/wordml/sdtformatlock" xmlns:w16se="http://schemas.microsoft.com/office/word/2015/wordml/symex" xmlns:wpg="http://schemas.microsoft.com/office/word/2010/wordprocessingGroup" xmlns:wpi="http://schemas.microsoft.com/office/word/2010/wordprocessingInk" xmlns:wne="http://schemas.microsoft.com/office/word/2006/wordml" xmlns:wps="http://schemas.microsoft.com/office/word/2010/wordprocessingShape" mc:Ignorable="w14 w15 w16se w16cid w16 w16cex w16sdtdh w16sdtfl w16du wp14">
   <w:p>
     <w:pPr>
@@ -7698,6 +7183,16 @@
 </w:ftr>
 </file>
 
+<file path=word/footer3.xml><?xml version="1.0" encoding="utf-8"?>
+<w:ftr xmlns:wpc="http://schemas.microsoft.com/office/word/2010/wordprocessingCanvas" xmlns:cx="http://schemas.microsoft.com/office/drawing/2014/chartex" xmlns:cx1="http://schemas.microsoft.com/office/drawing/2015/9/8/chartex" xmlns:cx2="http://schemas.microsoft.com/office/drawing/2015/10/21/chartex" xmlns:cx3="http://schemas.microsoft.com/office/drawing/2016/5/9/chartex" xmlns:cx4="http://schemas.microsoft.com/office/drawing/2016/5/10/chartex" xmlns:cx5="http://schemas.microsoft.com/office/drawing/2016/5/11/chartex" xmlns:cx6="http://schemas.microsoft.com/office/drawing/2016/5/12/chartex" xmlns:cx7="http://schemas.microsoft.com/office/drawing/2016/5/13/chartex" xmlns:cx8="http://schemas.microsoft.com/office/drawing/2016/5/14/chartex" xmlns:mc="http://schemas.openxmlformats.org/markup-compatibility/2006" xmlns:aink="http://schemas.microsoft.com/office/drawing/2016/ink" xmlns:am3d="http://schemas.microsoft.com/office/drawing/2017/model3d" xmlns:o="urn:schemas-microsoft-com:office:office" xmlns:oel="http://schemas.microsoft.com/office/2019/extlst" xmlns:r="http://schemas.openxmlformats.org/officeDocument/2006/relationships" xmlns:m="http://schemas.openxmlformats.org/officeDocument/2006/math" xmlns:v="urn:schemas-microsoft-com:vml" xmlns:wp14="http://schemas.microsoft.com/office/word/2010/wordprocessingDrawing" xmlns:wp="http://schemas.openxmlformats.org/drawingml/2006/wordprocessingDrawing" xmlns:w10="urn:schemas-microsoft-com:office:word" xmlns:w="http://schemas.openxmlformats.org/wordprocessingml/2006/main" xmlns:w14="http://schemas.microsoft.com/office/word/2010/wordml" xmlns:w15="http://schemas.microsoft.com/office/word/2012/wordml" xmlns:w16cex="http://schemas.microsoft.com/office/word/2018/wordml/cex" xmlns:w16cid="http://schemas.microsoft.com/office/word/2016/wordml/cid" xmlns:w16="http://schemas.microsoft.com/office/word/2018/wordml" xmlns:w16du="http://schemas.microsoft.com/office/word/2023/wordml/word16du" xmlns:w16sdtdh="http://schemas.microsoft.com/office/word/2020/wordml/sdtdatahash" xmlns:w16sdtfl="http://schemas.microsoft.com/office/word/2024/wordml/sdtformatlock" xmlns:w16se="http://schemas.microsoft.com/office/word/2015/wordml/symex" xmlns:wpg="http://schemas.microsoft.com/office/word/2010/wordprocessingGroup" xmlns:wpi="http://schemas.microsoft.com/office/word/2010/wordprocessingInk" xmlns:wne="http://schemas.microsoft.com/office/word/2006/wordml" xmlns:wps="http://schemas.microsoft.com/office/word/2010/wordprocessingShape" mc:Ignorable="w14 w15 w16se w16cid w16 w16cex w16sdtdh w16sdtfl w16du wp14">
+  <w:p>
+    <w:pPr>
+      <w:pStyle w:val="Footer"/>
+    </w:pPr>
+  </w:p>
+</w:ftr>
+</file>
+
 <file path=word/footnotes.xml><?xml version="1.0" encoding="utf-8"?>
 <w:footnotes xmlns:wpc="http://schemas.microsoft.com/office/word/2010/wordprocessingCanvas" xmlns:cx="http://schemas.microsoft.com/office/drawing/2014/chartex" xmlns:cx1="http://schemas.microsoft.com/office/drawing/2015/9/8/chartex" xmlns:cx2="http://schemas.microsoft.com/office/drawing/2015/10/21/chartex" xmlns:cx3="http://schemas.microsoft.com/office/drawing/2016/5/9/chartex" xmlns:cx4="http://schemas.microsoft.com/office/drawing/2016/5/10/chartex" xmlns:cx5="http://schemas.microsoft.com/office/drawing/2016/5/11/chartex" xmlns:cx6="http://schemas.microsoft.com/office/drawing/2016/5/12/chartex" xmlns:cx7="http://schemas.microsoft.com/office/drawing/2016/5/13/chartex" xmlns:cx8="http://schemas.microsoft.com/office/drawing/2016/5/14/chartex" xmlns:mc="http://schemas.openxmlformats.org/markup-compatibility/2006" xmlns:aink="http://schemas.microsoft.com/office/drawing/2016/ink" xmlns:am3d="http://schemas.microsoft.com/office/drawing/2017/model3d" xmlns:o="urn:schemas-microsoft-com:office:office" xmlns:oel="http://schemas.microsoft.com/office/2019/extlst" xmlns:r="http://schemas.openxmlformats.org/officeDocument/2006/relationships" xmlns:m="http://schemas.openxmlformats.org/officeDocument/2006/math" xmlns:v="urn:schemas-microsoft-com:vml" xmlns:wp14="http://schemas.microsoft.com/office/word/2010/wordprocessingDrawing" xmlns:wp="http://schemas.openxmlformats.org/drawingml/2006/wordprocessingDrawing" xmlns:w10="urn:schemas-microsoft-com:office:word" xmlns:w="http://schemas.openxmlformats.org/wordprocessingml/2006/main" xmlns:w14="http://schemas.microsoft.com/office/word/2010/wordml" xmlns:w15="http://schemas.microsoft.com/office/word/2012/wordml" xmlns:w16cex="http://schemas.microsoft.com/office/word/2018/wordml/cex" xmlns:w16cid="http://schemas.microsoft.com/office/word/2016/wordml/cid" xmlns:w16="http://schemas.microsoft.com/office/word/2018/wordml" xmlns:w16du="http://schemas.microsoft.com/office/word/2023/wordml/word16du" xmlns:w16sdtdh="http://schemas.microsoft.com/office/word/2020/wordml/sdtdatahash" xmlns:w16sdtfl="http://schemas.microsoft.com/office/word/2024/wordml/sdtformatlock" xmlns:w16se="http://schemas.microsoft.com/office/word/2015/wordml/symex" xmlns:wpg="http://schemas.microsoft.com/office/word/2010/wordprocessingGroup" xmlns:wpi="http://schemas.microsoft.com/office/word/2010/wordprocessingInk" xmlns:wne="http://schemas.microsoft.com/office/word/2006/wordml" xmlns:wps="http://schemas.microsoft.com/office/word/2010/wordprocessingShape" mc:Ignorable="w14 w15 w16se w16cid w16 w16cex w16sdtdh w16sdtfl w16du wp14">
   <w:footnote w:type="separator" w:id="-1">
@@ -7724,6 +7219,16 @@
 </file>
 
 <file path=word/header1.xml><?xml version="1.0" encoding="utf-8"?>
+<w:hdr xmlns:wpc="http://schemas.microsoft.com/office/word/2010/wordprocessingCanvas" xmlns:cx="http://schemas.microsoft.com/office/drawing/2014/chartex" xmlns:cx1="http://schemas.microsoft.com/office/drawing/2015/9/8/chartex" xmlns:cx2="http://schemas.microsoft.com/office/drawing/2015/10/21/chartex" xmlns:cx3="http://schemas.microsoft.com/office/drawing/2016/5/9/chartex" xmlns:cx4="http://schemas.microsoft.com/office/drawing/2016/5/10/chartex" xmlns:cx5="http://schemas.microsoft.com/office/drawing/2016/5/11/chartex" xmlns:cx6="http://schemas.microsoft.com/office/drawing/2016/5/12/chartex" xmlns:cx7="http://schemas.microsoft.com/office/drawing/2016/5/13/chartex" xmlns:cx8="http://schemas.microsoft.com/office/drawing/2016/5/14/chartex" xmlns:mc="http://schemas.openxmlformats.org/markup-compatibility/2006" xmlns:aink="http://schemas.microsoft.com/office/drawing/2016/ink" xmlns:am3d="http://schemas.microsoft.com/office/drawing/2017/model3d" xmlns:o="urn:schemas-microsoft-com:office:office" xmlns:oel="http://schemas.microsoft.com/office/2019/extlst" xmlns:r="http://schemas.openxmlformats.org/officeDocument/2006/relationships" xmlns:m="http://schemas.openxmlformats.org/officeDocument/2006/math" xmlns:v="urn:schemas-microsoft-com:vml" xmlns:wp14="http://schemas.microsoft.com/office/word/2010/wordprocessingDrawing" xmlns:wp="http://schemas.openxmlformats.org/drawingml/2006/wordprocessingDrawing" xmlns:w10="urn:schemas-microsoft-com:office:word" xmlns:w="http://schemas.openxmlformats.org/wordprocessingml/2006/main" xmlns:w14="http://schemas.microsoft.com/office/word/2010/wordml" xmlns:w15="http://schemas.microsoft.com/office/word/2012/wordml" xmlns:w16cex="http://schemas.microsoft.com/office/word/2018/wordml/cex" xmlns:w16cid="http://schemas.microsoft.com/office/word/2016/wordml/cid" xmlns:w16="http://schemas.microsoft.com/office/word/2018/wordml" xmlns:w16du="http://schemas.microsoft.com/office/word/2023/wordml/word16du" xmlns:w16sdtdh="http://schemas.microsoft.com/office/word/2020/wordml/sdtdatahash" xmlns:w16sdtfl="http://schemas.microsoft.com/office/word/2024/wordml/sdtformatlock" xmlns:w16se="http://schemas.microsoft.com/office/word/2015/wordml/symex" xmlns:wpg="http://schemas.microsoft.com/office/word/2010/wordprocessingGroup" xmlns:wpi="http://schemas.microsoft.com/office/word/2010/wordprocessingInk" xmlns:wne="http://schemas.microsoft.com/office/word/2006/wordml" xmlns:wps="http://schemas.microsoft.com/office/word/2010/wordprocessingShape" mc:Ignorable="w14 w15 w16se w16cid w16 w16cex w16sdtdh w16sdtfl w16du wp14">
+  <w:p>
+    <w:pPr>
+      <w:pStyle w:val="Header"/>
+    </w:pPr>
+  </w:p>
+</w:hdr>
+</file>
+
+<file path=word/header2.xml><?xml version="1.0" encoding="utf-8"?>
 <w:hdr xmlns:wpc="http://schemas.microsoft.com/office/word/2010/wordprocessingCanvas" xmlns:cx="http://schemas.microsoft.com/office/drawing/2014/chartex" xmlns:cx1="http://schemas.microsoft.com/office/drawing/2015/9/8/chartex" xmlns:cx2="http://schemas.microsoft.com/office/drawing/2015/10/21/chartex" xmlns:cx3="http://schemas.microsoft.com/office/drawing/2016/5/9/chartex" xmlns:cx4="http://schemas.microsoft.com/office/drawing/2016/5/10/chartex" xmlns:cx5="http://schemas.microsoft.com/office/drawing/2016/5/11/chartex" xmlns:cx6="http://schemas.microsoft.com/office/drawing/2016/5/12/chartex" xmlns:cx7="http://schemas.microsoft.com/office/drawing/2016/5/13/chartex" xmlns:cx8="http://schemas.microsoft.com/office/drawing/2016/5/14/chartex" xmlns:mc="http://schemas.openxmlformats.org/markup-compatibility/2006" xmlns:aink="http://schemas.microsoft.com/office/drawing/2016/ink" xmlns:am3d="http://schemas.microsoft.com/office/drawing/2017/model3d" xmlns:o="urn:schemas-microsoft-com:office:office" xmlns:oel="http://schemas.microsoft.com/office/2019/extlst" xmlns:r="http://schemas.openxmlformats.org/officeDocument/2006/relationships" xmlns:m="http://schemas.openxmlformats.org/officeDocument/2006/math" xmlns:v="urn:schemas-microsoft-com:vml" xmlns:wp14="http://schemas.microsoft.com/office/word/2010/wordprocessingDrawing" xmlns:wp="http://schemas.openxmlformats.org/drawingml/2006/wordprocessingDrawing" xmlns:w10="urn:schemas-microsoft-com:office:word" xmlns:w="http://schemas.openxmlformats.org/wordprocessingml/2006/main" xmlns:w14="http://schemas.microsoft.com/office/word/2010/wordml" xmlns:w15="http://schemas.microsoft.com/office/word/2012/wordml" xmlns:w16cex="http://schemas.microsoft.com/office/word/2018/wordml/cex" xmlns:w16cid="http://schemas.microsoft.com/office/word/2016/wordml/cid" xmlns:w16="http://schemas.microsoft.com/office/word/2018/wordml" xmlns:w16du="http://schemas.microsoft.com/office/word/2023/wordml/word16du" xmlns:w16sdtdh="http://schemas.microsoft.com/office/word/2020/wordml/sdtdatahash" xmlns:w16sdtfl="http://schemas.microsoft.com/office/word/2024/wordml/sdtformatlock" xmlns:w16se="http://schemas.microsoft.com/office/word/2015/wordml/symex" xmlns:wpg="http://schemas.microsoft.com/office/word/2010/wordprocessingGroup" xmlns:wpi="http://schemas.microsoft.com/office/word/2010/wordprocessingInk" xmlns:wne="http://schemas.microsoft.com/office/word/2006/wordml" xmlns:wps="http://schemas.microsoft.com/office/word/2010/wordprocessingShape" mc:Ignorable="w14 w15 w16se w16cid w16 w16cex w16sdtdh w16sdtfl w16du wp14">
   <w:p>
     <w:pPr>
@@ -7755,6 +7260,65 @@
       </w:rPr>
       <w:t>Team DIC005</w:t>
     </w:r>
+    <w:r>
+      <w:rPr>
+        <w:color w:val="404040"/>
+        <w:sz w:val="18"/>
+        <w:szCs w:val="18"/>
+      </w:rPr>
+      <w:t xml:space="preserve"> - Page </w:t>
+    </w:r>
+    <w:r>
+      <w:rPr>
+        <w:color w:val="404040"/>
+        <w:sz w:val="18"/>
+        <w:szCs w:val="18"/>
+      </w:rPr>
+      <w:fldChar w:fldCharType="begin"/>
+    </w:r>
+    <w:r>
+      <w:rPr>
+        <w:color w:val="404040"/>
+        <w:sz w:val="18"/>
+        <w:szCs w:val="18"/>
+      </w:rPr>
+      <w:instrText xml:space="preserve"> PAGE  \* MERGEFORMAT </w:instrText>
+    </w:r>
+    <w:r>
+      <w:rPr>
+        <w:color w:val="404040"/>
+        <w:sz w:val="18"/>
+        <w:szCs w:val="18"/>
+      </w:rPr>
+      <w:fldChar w:fldCharType="separate"/>
+    </w:r>
+    <w:r>
+      <w:rPr>
+        <w:noProof/>
+        <w:color w:val="404040"/>
+        <w:sz w:val="18"/>
+        <w:szCs w:val="18"/>
+      </w:rPr>
+      <w:t>2</w:t>
+    </w:r>
+    <w:r>
+      <w:rPr>
+        <w:color w:val="404040"/>
+        <w:sz w:val="18"/>
+        <w:szCs w:val="18"/>
+      </w:rPr>
+      <w:fldChar w:fldCharType="end"/>
+    </w:r>
+  </w:p>
+</w:hdr>
+</file>
+
+<file path=word/header3.xml><?xml version="1.0" encoding="utf-8"?>
+<w:hdr xmlns:wpc="http://schemas.microsoft.com/office/word/2010/wordprocessingCanvas" xmlns:cx="http://schemas.microsoft.com/office/drawing/2014/chartex" xmlns:cx1="http://schemas.microsoft.com/office/drawing/2015/9/8/chartex" xmlns:cx2="http://schemas.microsoft.com/office/drawing/2015/10/21/chartex" xmlns:cx3="http://schemas.microsoft.com/office/drawing/2016/5/9/chartex" xmlns:cx4="http://schemas.microsoft.com/office/drawing/2016/5/10/chartex" xmlns:cx5="http://schemas.microsoft.com/office/drawing/2016/5/11/chartex" xmlns:cx6="http://schemas.microsoft.com/office/drawing/2016/5/12/chartex" xmlns:cx7="http://schemas.microsoft.com/office/drawing/2016/5/13/chartex" xmlns:cx8="http://schemas.microsoft.com/office/drawing/2016/5/14/chartex" xmlns:mc="http://schemas.openxmlformats.org/markup-compatibility/2006" xmlns:aink="http://schemas.microsoft.com/office/drawing/2016/ink" xmlns:am3d="http://schemas.microsoft.com/office/drawing/2017/model3d" xmlns:o="urn:schemas-microsoft-com:office:office" xmlns:oel="http://schemas.microsoft.com/office/2019/extlst" xmlns:r="http://schemas.openxmlformats.org/officeDocument/2006/relationships" xmlns:m="http://schemas.openxmlformats.org/officeDocument/2006/math" xmlns:v="urn:schemas-microsoft-com:vml" xmlns:wp14="http://schemas.microsoft.com/office/word/2010/wordprocessingDrawing" xmlns:wp="http://schemas.openxmlformats.org/drawingml/2006/wordprocessingDrawing" xmlns:w10="urn:schemas-microsoft-com:office:word" xmlns:w="http://schemas.openxmlformats.org/wordprocessingml/2006/main" xmlns:w14="http://schemas.microsoft.com/office/word/2010/wordml" xmlns:w15="http://schemas.microsoft.com/office/word/2012/wordml" xmlns:w16cex="http://schemas.microsoft.com/office/word/2018/wordml/cex" xmlns:w16cid="http://schemas.microsoft.com/office/word/2016/wordml/cid" xmlns:w16="http://schemas.microsoft.com/office/word/2018/wordml" xmlns:w16du="http://schemas.microsoft.com/office/word/2023/wordml/word16du" xmlns:w16sdtdh="http://schemas.microsoft.com/office/word/2020/wordml/sdtdatahash" xmlns:w16sdtfl="http://schemas.microsoft.com/office/word/2024/wordml/sdtformatlock" xmlns:w16se="http://schemas.microsoft.com/office/word/2015/wordml/symex" xmlns:wpg="http://schemas.microsoft.com/office/word/2010/wordprocessingGroup" xmlns:wpi="http://schemas.microsoft.com/office/word/2010/wordprocessingInk" xmlns:wne="http://schemas.microsoft.com/office/word/2006/wordml" xmlns:wps="http://schemas.microsoft.com/office/word/2010/wordprocessingShape" mc:Ignorable="w14 w15 w16se w16cid w16 w16cex w16sdtdh w16sdtfl w16du wp14">
+  <w:p>
+    <w:pPr>
+      <w:pStyle w:val="Header"/>
+    </w:pPr>
   </w:p>
 </w:hdr>
 </file>

</xml_diff>